<commit_message>
chore: update final submission documents
Update final report and slides under document/ and ignore Office temp files.

Made-with: Cursor
</commit_message>
<xml_diff>
--- a/document/Technical Report.docx
+++ b/document/Technical Report.docx
@@ -802,8 +802,25 @@
         <w:t>This report expounds the architecture idea and engineering implementation details of Nutrition &amp; Recipe Analytics API system in detail. The project successfully built a back-end service platform with complete functions, strict logic and high scalability. The system not only fully meets the specified technical threshold, but also shows excellent design level and implementation ability in core engineering fields such as security strategy formulation, software quality assurance and data value mining, laying a solid system foundation for future large-scale expansion.</w:t>
       </w:r>
     </w:p>
-    <w:p>
-      <w:r>
+    <w:p/>
+    <w:p>
+      <w:pPr>
+        <w:rPr>
+          <w:rFonts w:hint="eastAsia"/>
+          <w:b/>
+          <w:bCs/>
+          <w:sz w:val="24"/>
+          <w:szCs w:val="32"/>
+        </w:rPr>
+      </w:pPr>
+      <w:r>
+        <w:rPr>
+          <w:rFonts w:hint="eastAsia"/>
+          <w:b/>
+          <w:bCs/>
+          <w:sz w:val="24"/>
+          <w:szCs w:val="32"/>
+        </w:rPr>
         <w:br w:type="page"/>
       </w:r>
     </w:p>
@@ -1254,26 +1271,322 @@
         </w:rPr>
         <w:t>6</w:t>
       </w:r>
+      <w:r>
+        <w:rPr>
+          <w:rFonts w:hint="eastAsia"/>
+          <w:b/>
+          <w:bCs/>
+          <w:i/>
+          <w:iCs/>
+        </w:rPr>
+        <w:t>. AI-generated Python data cleaning pipeline for extracting and normalizing numeric values from raw CSV datasets.</w:t>
+      </w:r>
+    </w:p>
+    <w:p>
+      <w:pPr>
+        <w:rPr>
+          <w:rFonts w:hint="eastAsia" w:eastAsiaTheme="minorEastAsia"/>
+          <w:b/>
+          <w:bCs/>
+          <w:sz w:val="28"/>
+          <w:szCs w:val="36"/>
+          <w:lang w:eastAsia="zh-CN"/>
+        </w:rPr>
+      </w:pPr>
+      <w:r>
+        <w:rPr>
+          <w:rFonts w:hint="eastAsia" w:eastAsiaTheme="minorEastAsia"/>
+          <w:b/>
+          <w:bCs/>
+          <w:sz w:val="28"/>
+          <w:szCs w:val="36"/>
+          <w:lang w:eastAsia="zh-CN"/>
+        </w:rPr>
+        <w:br w:type="page"/>
+      </w:r>
+    </w:p>
+    <w:p>
+      <w:pPr>
+        <w:rPr>
+          <w:rFonts w:hint="eastAsia" w:eastAsiaTheme="minorEastAsia"/>
+          <w:b/>
+          <w:bCs/>
+          <w:sz w:val="28"/>
+          <w:szCs w:val="36"/>
+          <w:lang w:eastAsia="zh-CN"/>
+        </w:rPr>
+      </w:pPr>
       <w:bookmarkStart w:id="0" w:name="_GoBack"/>
       <w:bookmarkEnd w:id="0"/>
       <w:r>
         <w:rPr>
-          <w:rFonts w:hint="eastAsia"/>
-          <w:b/>
-          <w:bCs/>
-          <w:i/>
-          <w:iCs/>
-        </w:rPr>
-        <w:t>. AI-generated Python data cleaning pipeline for extracting and normalizing numeric values from raw CSV datasets.</w:t>
-      </w:r>
-    </w:p>
-    <w:p>
-      <w:pPr>
-        <w:rPr>
-          <w:rFonts w:hint="eastAsia" w:eastAsiaTheme="minorEastAsia"/>
-          <w:lang w:eastAsia="zh-CN"/>
-        </w:rPr>
-      </w:pPr>
+          <w:rFonts w:hint="eastAsia" w:eastAsiaTheme="minorEastAsia"/>
+          <w:b/>
+          <w:bCs/>
+          <w:sz w:val="28"/>
+          <w:szCs w:val="36"/>
+          <w:lang w:eastAsia="zh-CN"/>
+        </w:rPr>
+        <w:t>Submission Links (for examiners &amp; Minerva submission)</w:t>
+      </w:r>
+    </w:p>
+    <w:p>
+      <w:pPr>
+        <w:rPr>
+          <w:rFonts w:hint="eastAsia" w:eastAsiaTheme="minorEastAsia"/>
+          <w:lang w:eastAsia="zh-CN"/>
+        </w:rPr>
+      </w:pPr>
+      <w:r>
+        <w:rPr>
+          <w:rFonts w:hint="eastAsia" w:eastAsiaTheme="minorEastAsia"/>
+          <w:lang w:eastAsia="zh-CN"/>
+        </w:rPr>
+        <w:t>This project’s public GitHub repository (including full commit history, runnable source code, and all required submission artefacts) is available at:</w:t>
+      </w:r>
+    </w:p>
+    <w:p>
+      <w:pPr>
+        <w:rPr>
+          <w:rFonts w:hint="eastAsia" w:eastAsiaTheme="minorEastAsia"/>
+          <w:lang w:eastAsia="zh-CN"/>
+        </w:rPr>
+      </w:pPr>
+      <w:r>
+        <w:rPr>
+          <w:rFonts w:hint="eastAsia" w:eastAsiaTheme="minorEastAsia"/>
+          <w:lang w:eastAsia="zh-CN"/>
+        </w:rPr>
+        <w:t>https://github.com/jinjerry123456/nutrition-recipe-api</w:t>
+      </w:r>
+    </w:p>
+    <w:p>
+      <w:pPr>
+        <w:rPr>
+          <w:rFonts w:hint="eastAsia" w:eastAsiaTheme="minorEastAsia"/>
+          <w:lang w:eastAsia="zh-CN"/>
+        </w:rPr>
+      </w:pPr>
+    </w:p>
+    <w:p>
+      <w:pPr>
+        <w:rPr>
+          <w:rFonts w:hint="eastAsia" w:eastAsiaTheme="minorEastAsia"/>
+          <w:lang w:eastAsia="zh-CN"/>
+        </w:rPr>
+      </w:pPr>
+      <w:r>
+        <w:rPr>
+          <w:rFonts w:hint="eastAsia" w:eastAsiaTheme="minorEastAsia"/>
+          <w:lang w:eastAsia="zh-CN"/>
+        </w:rPr>
+        <w:t>A live deployed version of the API is hosted on Render and can be accessed at:</w:t>
+      </w:r>
+    </w:p>
+    <w:p>
+      <w:pPr>
+        <w:rPr>
+          <w:rFonts w:hint="eastAsia" w:eastAsiaTheme="minorEastAsia"/>
+          <w:lang w:eastAsia="zh-CN"/>
+        </w:rPr>
+      </w:pPr>
+      <w:r>
+        <w:rPr>
+          <w:rFonts w:hint="eastAsia" w:eastAsiaTheme="minorEastAsia"/>
+          <w:lang w:eastAsia="zh-CN"/>
+        </w:rPr>
+        <w:t>https://mcdonalds-api-jhd9.onrender.com</w:t>
+      </w:r>
+    </w:p>
+    <w:p>
+      <w:pPr>
+        <w:rPr>
+          <w:rFonts w:hint="eastAsia" w:eastAsiaTheme="minorEastAsia"/>
+          <w:lang w:eastAsia="zh-CN"/>
+        </w:rPr>
+      </w:pPr>
+    </w:p>
+    <w:p>
+      <w:pPr>
+        <w:rPr>
+          <w:rFonts w:hint="eastAsia" w:eastAsiaTheme="minorEastAsia"/>
+          <w:lang w:eastAsia="zh-CN"/>
+        </w:rPr>
+      </w:pPr>
+      <w:r>
+        <w:rPr>
+          <w:rFonts w:hint="eastAsia" w:eastAsiaTheme="minorEastAsia"/>
+          <w:lang w:eastAsia="zh-CN"/>
+        </w:rPr>
+        <w:t>The interactive OpenAPI/Swagger documentation for the deployed API is available at:</w:t>
+      </w:r>
+    </w:p>
+    <w:p>
+      <w:pPr>
+        <w:rPr>
+          <w:rFonts w:hint="eastAsia" w:eastAsiaTheme="minorEastAsia"/>
+          <w:lang w:eastAsia="zh-CN"/>
+        </w:rPr>
+      </w:pPr>
+      <w:r>
+        <w:rPr>
+          <w:rFonts w:hint="eastAsia" w:eastAsiaTheme="minorEastAsia"/>
+          <w:lang w:eastAsia="zh-CN"/>
+        </w:rPr>
+        <w:t>https://mcdonalds-api-jhd9.onrender.com/docs</w:t>
+      </w:r>
+    </w:p>
+    <w:p>
+      <w:pPr>
+        <w:rPr>
+          <w:rFonts w:hint="eastAsia" w:eastAsiaTheme="minorEastAsia"/>
+          <w:lang w:eastAsia="zh-CN"/>
+        </w:rPr>
+      </w:pPr>
+      <w:r>
+        <w:rPr>
+          <w:rFonts w:hint="eastAsia" w:eastAsiaTheme="minorEastAsia"/>
+          <w:lang w:eastAsia="zh-CN"/>
+        </w:rPr>
+        <w:t>(Alternative ReDoc view: https://mcdonalds-api-jhd9.onrender.com/redoc)</w:t>
+      </w:r>
+    </w:p>
+    <w:p>
+      <w:pPr>
+        <w:rPr>
+          <w:rFonts w:hint="eastAsia" w:eastAsiaTheme="minorEastAsia"/>
+          <w:lang w:eastAsia="zh-CN"/>
+        </w:rPr>
+      </w:pPr>
+    </w:p>
+    <w:p>
+      <w:pPr>
+        <w:rPr>
+          <w:rFonts w:hint="eastAsia" w:eastAsiaTheme="minorEastAsia"/>
+          <w:lang w:eastAsia="zh-CN"/>
+        </w:rPr>
+      </w:pPr>
+      <w:r>
+        <w:rPr>
+          <w:rFonts w:hint="eastAsia" w:eastAsiaTheme="minorEastAsia"/>
+          <w:lang w:eastAsia="zh-CN"/>
+        </w:rPr>
+        <w:t>The submitted API documentation (PDF) is stored in the repository under the document/ folder and can be accessed at:</w:t>
+      </w:r>
+    </w:p>
+    <w:p>
+      <w:pPr>
+        <w:rPr>
+          <w:rFonts w:hint="eastAsia" w:eastAsiaTheme="minorEastAsia"/>
+          <w:lang w:eastAsia="zh-CN"/>
+        </w:rPr>
+      </w:pPr>
+      <w:r>
+        <w:rPr>
+          <w:rFonts w:hint="eastAsia" w:eastAsiaTheme="minorEastAsia"/>
+          <w:lang w:eastAsia="zh-CN"/>
+        </w:rPr>
+        <w:t>https://github.com/jinjerry123456/nutrition-recipe-api/blob/main/document/API%20Documentation.pdf</w:t>
+      </w:r>
+    </w:p>
+    <w:p>
+      <w:pPr>
+        <w:rPr>
+          <w:rFonts w:hint="eastAsia" w:eastAsiaTheme="minorEastAsia"/>
+          <w:lang w:eastAsia="zh-CN"/>
+        </w:rPr>
+      </w:pPr>
+    </w:p>
+    <w:p>
+      <w:pPr>
+        <w:rPr>
+          <w:rFonts w:hint="eastAsia" w:eastAsiaTheme="minorEastAsia"/>
+          <w:lang w:eastAsia="zh-CN"/>
+        </w:rPr>
+      </w:pPr>
+      <w:r>
+        <w:rPr>
+          <w:rFonts w:hint="eastAsia" w:eastAsiaTheme="minorEastAsia"/>
+          <w:lang w:eastAsia="zh-CN"/>
+        </w:rPr>
+        <w:t>The submitted technical report (PDF, maximum 5 pages) is stored in the repository under the document/ folder and can be accessed at:</w:t>
+      </w:r>
+    </w:p>
+    <w:p>
+      <w:pPr>
+        <w:rPr>
+          <w:rFonts w:hint="eastAsia" w:eastAsiaTheme="minorEastAsia"/>
+          <w:lang w:eastAsia="zh-CN"/>
+        </w:rPr>
+      </w:pPr>
+      <w:r>
+        <w:rPr>
+          <w:rFonts w:hint="eastAsia" w:eastAsiaTheme="minorEastAsia"/>
+          <w:lang w:eastAsia="zh-CN"/>
+        </w:rPr>
+        <w:t>https://github.com/jinjerry123456/nutrition-recipe-api/blob/main/document/Technical%20Report.pdf</w:t>
+      </w:r>
+    </w:p>
+    <w:p>
+      <w:pPr>
+        <w:rPr>
+          <w:rFonts w:hint="eastAsia" w:eastAsiaTheme="minorEastAsia"/>
+          <w:lang w:eastAsia="zh-CN"/>
+        </w:rPr>
+      </w:pPr>
+    </w:p>
+    <w:p>
+      <w:pPr>
+        <w:rPr>
+          <w:rFonts w:hint="eastAsia" w:eastAsiaTheme="minorEastAsia"/>
+          <w:lang w:eastAsia="zh-CN"/>
+        </w:rPr>
+      </w:pPr>
+      <w:r>
+        <w:rPr>
+          <w:rFonts w:hint="eastAsia" w:eastAsiaTheme="minorEastAsia"/>
+          <w:lang w:eastAsia="zh-CN"/>
+        </w:rPr>
+        <w:t>The presentation slides used for the oral examination (PPTX) are stored in the repository under the document/ folder and can be accessed at:</w:t>
+      </w:r>
+    </w:p>
+    <w:p>
+      <w:pPr>
+        <w:rPr>
+          <w:rFonts w:hint="eastAsia" w:eastAsiaTheme="minorEastAsia"/>
+          <w:lang w:eastAsia="zh-CN"/>
+        </w:rPr>
+      </w:pPr>
+      <w:r>
+        <w:rPr>
+          <w:rFonts w:hint="eastAsia" w:eastAsiaTheme="minorEastAsia"/>
+          <w:lang w:eastAsia="zh-CN"/>
+        </w:rPr>
+        <w:t>https://github.com/jinjerry123456/nutrition-recipe-api/blob/main/document/slide.pptx</w:t>
+      </w:r>
+    </w:p>
+    <w:p>
+      <w:pPr>
+        <w:rPr>
+          <w:rFonts w:hint="eastAsia" w:eastAsiaTheme="minorEastAsia"/>
+          <w:lang w:eastAsia="zh-CN"/>
+        </w:rPr>
+      </w:pPr>
+    </w:p>
+    <w:p>
+      <w:pPr>
+        <w:rPr>
+          <w:rFonts w:hint="eastAsia" w:eastAsiaTheme="minorEastAsia"/>
+          <w:lang w:eastAsia="zh-CN"/>
+        </w:rPr>
+      </w:pPr>
+      <w:r>
+        <w:rPr>
+          <w:rFonts w:hint="eastAsia" w:eastAsiaTheme="minorEastAsia"/>
+          <w:lang w:eastAsia="zh-CN"/>
+        </w:rPr>
+        <w:t>Note: If any of the above repository file links are not accessible, it indicates the latest commits have not yet been pushed to GitHub. In that case, the repository should be pushed and the links will become immediately available.</w:t>
+      </w:r>
     </w:p>
     <w:p>
       <w:pPr>

</xml_diff>